<commit_message>
Clean unused native files and add references
</commit_message>
<xml_diff>
--- a/FLORALIFE_PRINT_DOCUMENTATION.docx
+++ b/FLORALIFE_PRINT_DOCUMENTATION.docx
@@ -604,32 +604,67 @@
     <w:p/>
     <w:p>
       <w:r>
-        <w:t xml:space="preserve">- Google Gemini API documentation</w:t>
-      </w:r>
-    </w:p>
-    <w:p>
-      <w:r>
-        <w:t xml:space="preserve">- Capacitor App plugin</w:t>
-      </w:r>
-    </w:p>
-    <w:p>
-      <w:r>
-        <w:t xml:space="preserve">- Capacitor Local Notifications plugin</w:t>
-      </w:r>
-    </w:p>
-    <w:p>
-      <w:r>
-        <w:t xml:space="preserve">- Capacitor Camera plugin</w:t>
-      </w:r>
-    </w:p>
-    <w:p>
-      <w:r>
-        <w:t xml:space="preserve">- TensorFlow Lite Android integration</w:t>
-      </w:r>
-    </w:p>
-    <w:p>
-      <w:r>
-        <w:t xml:space="preserve">- PlantVillage-style class dataset used for offline-model-aligned presentation samples</w:t>
+        <w:t xml:space="preserve">- React documentation: https://react.dev/</w:t>
+      </w:r>
+    </w:p>
+    <w:p>
+      <w:r>
+        <w:t xml:space="preserve">- TypeScript documentation: https://www.typescriptlang.org/docs/</w:t>
+      </w:r>
+    </w:p>
+    <w:p>
+      <w:r>
+        <w:t xml:space="preserve">- Vite guide: https://vite.dev/guide/</w:t>
+      </w:r>
+    </w:p>
+    <w:p>
+      <w:r>
+        <w:t xml:space="preserve">- Tailwind CSS documentation: https://tailwindcss.com/docs</w:t>
+      </w:r>
+    </w:p>
+    <w:p>
+      <w:r>
+        <w:t xml:space="preserve">- Capacitor documentation: https://capacitorjs.com/docs</w:t>
+      </w:r>
+    </w:p>
+    <w:p>
+      <w:r>
+        <w:t xml:space="preserve">- Capacitor App plugin: https://capacitorjs.com/docs/apis/app</w:t>
+      </w:r>
+    </w:p>
+    <w:p>
+      <w:r>
+        <w:t xml:space="preserve">- Capacitor Camera plugin: https://capacitorjs.com/docs/apis/camera</w:t>
+      </w:r>
+    </w:p>
+    <w:p>
+      <w:r>
+        <w:t xml:space="preserve">- Capacitor Local Notifications plugin: https://capacitorjs.com/docs/apis/local-notifications</w:t>
+      </w:r>
+    </w:p>
+    <w:p>
+      <w:r>
+        <w:t xml:space="preserve">- Gemini API documentation: https://ai.google.dev/gemini-api/docs</w:t>
+      </w:r>
+    </w:p>
+    <w:p>
+      <w:r>
+        <w:t xml:space="preserve">- TensorFlow Lite on Android: https://www.tensorflow.org/lite/android</w:t>
+      </w:r>
+    </w:p>
+    <w:p>
+      <w:r>
+        <w:t xml:space="preserve">- Offline model asset reference: https://github.com/akshayrana30/plant-disease-detection/tree/master/PlantSaverApp/app/src/main/assets</w:t>
+      </w:r>
+    </w:p>
+    <w:p>
+      <w:r>
+        <w:t xml:space="preserve">- PlantVillage dataset mirror for presentation samples: https://github.com/spMohanty/PlantVillage-Dataset/tree/master/raw/color</w:t>
+      </w:r>
+    </w:p>
+    <w:p>
+      <w:r>
+        <w:t xml:space="preserve">- Local project sample-source manifest: `presentation/offline-ai-samples/sources.csv`</w:t>
       </w:r>
     </w:p>
     <w:sectPr>

</xml_diff>

<commit_message>
Prepare GitHub-safe APK release and Gemini keys
</commit_message>
<xml_diff>
--- a/FLORALIFE_PRINT_DOCUMENTATION.docx
+++ b/FLORALIFE_PRINT_DOCUMENTATION.docx
@@ -273,6 +273,41 @@
         <w:pStyle w:val="Heading2"/>
       </w:pPr>
       <w:r>
+        <w:t xml:space="preserve">API Key Handling</w:t>
+      </w:r>
+    </w:p>
+    <w:p/>
+    <w:p>
+      <w:r>
+        <w:t xml:space="preserve">- Developers can keep a private Gemini key in `.env.local`</w:t>
+      </w:r>
+    </w:p>
+    <w:p>
+      <w:r>
+        <w:t xml:space="preserve">- `.env.local` should never be committed to GitHub</w:t>
+      </w:r>
+    </w:p>
+    <w:p>
+      <w:r>
+        <w:t xml:space="preserve">- Users can also save a personal Gemini key directly inside FloraLife from `Scan &gt; Online AI`</w:t>
+      </w:r>
+    </w:p>
+    <w:p>
+      <w:r>
+        <w:t xml:space="preserve">- Personal keys stay only on the current device through local storage</w:t>
+      </w:r>
+    </w:p>
+    <w:p>
+      <w:r>
+        <w:t xml:space="preserve">- For public APK sharing, it is safer not to bundle a developer key into the app</w:t>
+      </w:r>
+    </w:p>
+    <w:p/>
+    <w:p>
+      <w:pPr>
+        <w:pStyle w:val="Heading2"/>
+      </w:pPr>
+      <w:r>
         <w:t xml:space="preserve">System Workflow</w:t>
       </w:r>
     </w:p>
@@ -575,6 +610,31 @@
     <w:p>
       <w:r>
         <w:t xml:space="preserve">- Open-source publishing and wider device testing</w:t>
+      </w:r>
+    </w:p>
+    <w:p/>
+    <w:p>
+      <w:pPr>
+        <w:pStyle w:val="Heading2"/>
+      </w:pPr>
+      <w:r>
+        <w:t xml:space="preserve">APK Release Preparation</w:t>
+      </w:r>
+    </w:p>
+    <w:p/>
+    <w:p>
+      <w:r>
+        <w:t xml:space="preserve">- Debug APK command: `npm run apk:debug`</w:t>
+      </w:r>
+    </w:p>
+    <w:p>
+      <w:r>
+        <w:t xml:space="preserve">- Release APK command: `npm run apk:release`</w:t>
+      </w:r>
+    </w:p>
+    <w:p>
+      <w:r>
+        <w:t xml:space="preserve">- Full release and API key notes are included in `APK_RELEASE_GUIDE.md`</w:t>
       </w:r>
     </w:p>
     <w:p/>

</xml_diff>